<commit_message>
Add branded cover page and PDF export
Updated the review sheet's cover page with the ʚଓ signature character (in
the brand green #10B981), the "Nivel A1" badge, and a copyright line:
© 2026 Claudia Toth · Toate drepturile rezervate (+ an "All rights reserved"
note below). Cover now has its own page, content starts on page 2.

Exported personalpronomen-nominativ.pdf from the updated docx via Word's
Save-As-PDF. This is the file the navbar's 📄 PDF link in index.html points
to, so the download button now works.

Co-Authored-By: Claude Opus 4.7 (1M context) <noreply@anthropic.com>
</commit_message>
<xml_diff>
--- a/fisa-personalpronomen-nominativ.docx
+++ b/fisa-personalpronomen-nominativ.docx
@@ -2,12 +2,48 @@
 <file path=word/document.xml><?xml version="1.0" encoding="utf-8"?>
 <w:document xmlns:w="http://schemas.openxmlformats.org/wordprocessingml/2006/main">
   <w:body>
+    <w:p/>
+    <w:p/>
+    <w:p>
+      <w:pPr>
+        <w:jc w:val="center"/>
+      </w:pPr>
+      <w:r>
+        <w:rPr>
+          <w:color w:val="10B981"/>
+          <w:sz w:val="96"/>
+        </w:rPr>
+        <w:t>ʚଓ</w:t>
+      </w:r>
+    </w:p>
+    <w:p>
+      <w:pPr>
+        <w:jc w:val="center"/>
+      </w:pPr>
+      <w:r>
+        <w:rPr>
+          <w:color w:val="10B981"/>
+        </w:rPr>
+        <w:t>━━━━━━━━━━━━━━━━━━━━</w:t>
+      </w:r>
+    </w:p>
     <w:p>
       <w:pPr>
         <w:pStyle w:val="Title"/>
       </w:pPr>
       <w:r>
         <w:t>Personalpronomen im Nominativ</w:t>
+      </w:r>
+    </w:p>
+    <w:p>
+      <w:pPr>
+        <w:jc w:val="center"/>
+      </w:pPr>
+      <w:r>
+        <w:rPr>
+          <w:color w:val="10B981"/>
+        </w:rPr>
+        <w:t>━━━━━━━━━━━━━━━━━━━━</w:t>
       </w:r>
     </w:p>
     <w:p>
@@ -18,23 +54,72 @@
         <w:rPr>
           <w:i/>
           <w:color w:val="6B7280"/>
+          <w:sz w:val="32"/>
+        </w:rPr>
+        <w:t>Pronumele personale la cazul Nominativ</w:t>
+      </w:r>
+    </w:p>
+    <w:p>
+      <w:pPr>
+        <w:jc w:val="center"/>
+      </w:pPr>
+      <w:r>
+        <w:rPr>
+          <w:b/>
+          <w:color w:val="059669"/>
           <w:sz w:val="28"/>
         </w:rPr>
-        <w:t>Pronumele personale la cazul Nominativ — Nivel A1</w:t>
-      </w:r>
-    </w:p>
+        <w:t>Nivel A1</w:t>
+      </w:r>
+    </w:p>
+    <w:p/>
+    <w:p/>
     <w:p>
       <w:pPr>
         <w:jc w:val="center"/>
       </w:pPr>
       <w:r>
         <w:rPr>
+          <w:b/>
+          <w:color w:val="065F46"/>
+          <w:sz w:val="36"/>
+        </w:rPr>
+        <w:t>Claudia Toth</w:t>
+      </w:r>
+    </w:p>
+    <w:p/>
+    <w:p/>
+    <w:p/>
+    <w:p>
+      <w:pPr>
+        <w:jc w:val="center"/>
+      </w:pPr>
+      <w:r>
+        <w:rPr>
           <w:color w:val="6B7280"/>
-        </w:rPr>
-        <w:t>Fișă pentru corectură · Claudia Toth</w:t>
-      </w:r>
-    </w:p>
-    <w:p/>
+          <w:sz w:val="20"/>
+        </w:rPr>
+        <w:t>© 2026 Claudia Toth · Toate drepturile rezervate</w:t>
+      </w:r>
+    </w:p>
+    <w:p>
+      <w:pPr>
+        <w:jc w:val="center"/>
+      </w:pPr>
+      <w:r>
+        <w:rPr>
+          <w:i/>
+          <w:color w:val="9CA3AF"/>
+          <w:sz w:val="18"/>
+        </w:rPr>
+        <w:t>All rights reserved · Reproducerea fără acord scris este interzisă.</w:t>
+      </w:r>
+    </w:p>
+    <w:p>
+      <w:r>
+        <w:br w:type="page"/>
+      </w:r>
+    </w:p>
     <w:p>
       <w:pPr>
         <w:pStyle w:val="Heading1"/>

</xml_diff>